<commit_message>
Capture 2 : remplace par la capture réelle de la structure (tree src /f)
Co-Authored-By: Claude Opus 5.5 <noreply@anthropic.com>
Claude-Session: https://claude.ai/code/session_014XSt6uc28vwYtpcdkvxHzk
</commit_message>
<xml_diff>
--- a/Rapport_StudentTasks_Diallo_Yaya.docx
+++ b/Rapport_StudentTasks_Diallo_Yaya.docx
@@ -189,14 +189,14 @@
     </w:p>
     <w:p>
       <w:r>
-        <w:t>Organisation des dossiers components et pages.</w:t>
+        <w:t>Organisation des dossiers components et pages (commande tree src /f).</w:t>
       </w:r>
     </w:p>
     <w:p>
       <w:r>
         <w:drawing>
           <wp:inline xmlns:a="http://schemas.openxmlformats.org/drawingml/2006/main" xmlns:pic="http://schemas.openxmlformats.org/drawingml/2006/picture">
-            <wp:extent cx="5760720" cy="6868551"/>
+            <wp:extent cx="5760720" cy="6174772"/>
             <wp:docPr id="2" name="Picture 2"/>
             <wp:cNvGraphicFramePr>
               <a:graphicFrameLocks noChangeAspect="1"/>
@@ -217,7 +217,7 @@
                   <pic:spPr>
                     <a:xfrm>
                       <a:off x="0" y="0"/>
-                      <a:ext cx="5760720" cy="6868551"/>
+                      <a:ext cx="5760720" cy="6174772"/>
                     </a:xfrm>
                     <a:prstGeom prst="rect"/>
                   </pic:spPr>

</xml_diff>